<commit_message>
Docs: correct the v2.0 documents against the live code; ignore service-account keys
- Sprint Plan: stories already live moved out; security fixes (SEC-01..05) and QA-01 added;
  Recharts/Vitest replaced by Chart.js/pytest; rebalanced to 13-19 points; Sprint 7 added.
- Project Plan, RAID, BRD, Architecture, Test Cases, Use Cases: PostgreSQL is live (not
  in-memory), frontend is Vite + plain JS, real endpoints/env vars, test statuses corrected.
- .gitignore: Firebase service-account key files.

Co-Authored-By: Claude Opus 5.5 <noreply@anthropic.com>
Claude-Session: https://claude.ai/code/session_01AFyT24RkX37m2MoRPATyVx
</commit_message>
<xml_diff>
--- a/Documents/BRD_ChurnSight_v2_0.docx
+++ b/Documents/BRD_ChurnSight_v2_0.docx
@@ -222,6 +222,29 @@
           <w:szCs w:val="18"/>
         </w:rPr>
         <w:t xml:space="preserve">October 2026</w:t>
+      </w:r>
+    </w:p>
+    <w:p>
+      <w:pPr>
+        <w:spacing w:after="40" w:before="40"/>
+      </w:pPr>
+      <w:r>
+        <w:rPr>
+          <w:b/>
+          <w:bCs/>
+          <w:color w:val="64748B"/>
+          <w:sz w:val="18"/>
+          <w:szCs w:val="18"/>
+        </w:rPr>
+        <w:t xml:space="preserve">Revised:  </w:t>
+      </w:r>
+      <w:r>
+        <w:rPr>
+          <w:color w:val="1E293B"/>
+          <w:sz w:val="18"/>
+          <w:szCs w:val="18"/>
+        </w:rPr>
+        <w:t xml:space="preserve">14 Oct 2026 — checked against the live code; see Change Log</w:t>
       </w:r>
     </w:p>
     <w:p>
@@ -1853,7 +1876,7 @@
           <w:sz w:val="20"/>
           <w:szCs w:val="20"/>
         </w:rPr>
-        <w:t xml:space="preserve">Railway hosting: web service + volume + PostgreSQL (future v2.1)</w:t>
+        <w:t xml:space="preserve">Railway hosting: web service + volume + PostgreSQL (live since Oct 2026)</w:t>
       </w:r>
     </w:p>
     <w:p>
@@ -2101,7 +2124,7 @@
           <w:sz w:val="20"/>
           <w:szCs w:val="20"/>
         </w:rPr>
-        <w:t xml:space="preserve">Persistent database per workspace (v2.1)</w:t>
+        <w:t xml:space="preserve">A separate database per workspace (all workspaces share one PostgreSQL database, isolated by row-level security)</w:t>
       </w:r>
     </w:p>
     <w:p>
@@ -2308,7 +2331,7 @@
           <w:sz w:val="20"/>
           <w:szCs w:val="20"/>
         </w:rPr>
-        <w:t xml:space="preserve">FR-04: Admin may adjust component weights from the Admin Console (future v2.1 persistent storage).</w:t>
+        <w:t xml:space="preserve">FR-04: Admin may adjust component weights from the Admin Console (stored in the database).</w:t>
       </w:r>
     </w:p>
     <w:p>
@@ -2568,7 +2591,7 @@
           <w:sz w:val="20"/>
           <w:szCs w:val="20"/>
         </w:rPr>
-        <w:t xml:space="preserve">FR-AC-01: Admin Console shall have a persistent sidebar with sections: Overview, Users, Workspaces, Audit, ML Ops, Email, Settings.</w:t>
+        <w:t xml:space="preserve">FR-AC-01: Admin Console shall have a persistent sidebar with sections: Overview, Users, Workspaces, Audit &amp; Security, Access, ML Ops, Email, Settings.</w:t>
       </w:r>
     </w:p>
     <w:p>
@@ -2656,7 +2679,7 @@
           <w:sz w:val="20"/>
           <w:szCs w:val="20"/>
         </w:rPr>
-        <w:t xml:space="preserve">FR-AC-05: Service health panel shall show real-time status of database, storage volume, encryption keys, schema, and email service (sourced from /api/health and /api/ready).</w:t>
+        <w:t xml:space="preserve">FR-AC-05: Service health panel shall show the status of database, schema, storage volume and encryption keys (from /api/ready) and of the email service (Brevo configuration).</w:t>
       </w:r>
     </w:p>
     <w:p>
@@ -2868,7 +2891,7 @@
           <w:sz w:val="20"/>
           <w:szCs w:val="20"/>
         </w:rPr>
-        <w:t xml:space="preserve">FR-AC-15: Data privacy requests (/api/privacy/*) shall be surfaced in the UI for GDPR export and erasure.</w:t>
+        <w:t xml:space="preserve">FR-AC-15: The privacy tools (/api/privacy/*: customer lookup, subject-access export, erasure) shall be available in the UI. Whether a GDPR request queue is also needed is open (DEC-02).</w:t>
       </w:r>
     </w:p>
     <w:p>
@@ -3966,7 +3989,7 @@
           <w:sz w:val="20"/>
           <w:szCs w:val="20"/>
         </w:rPr>
-        <w:t xml:space="preserve">Persistent workspace-level database (PostgreSQL) is a v2.1 dependency; admin console ML Ops and feature flags operate on in-memory state until then.</w:t>
+        <w:t xml:space="preserve">PostgreSQL is live on Railway; ML Ops data, component weights and feature flags are stored in it.</w:t>
       </w:r>
     </w:p>
     <w:p>
@@ -4374,6 +4397,58 @@
         </w:tc>
       </w:tr>
     </w:tbl>
+    <w:p>
+      <w:pPr>
+        <w:pStyle w:val="Heading2"/>
+        <w:spacing w:after="120" w:before="280"/>
+      </w:pPr>
+      <w:r>
+        <w:rPr>
+          <w:b/>
+          <w:bCs/>
+          <w:color w:val="176BFA"/>
+          <w:sz w:val="24"/>
+          <w:szCs w:val="24"/>
+        </w:rPr>
+        <w:t xml:space="preserve">11. CHANGE LOG</w:t>
+      </w:r>
+    </w:p>
+    <w:p>
+      <w:pPr>
+        <w:pStyle w:val="ListParagraph"/>
+        <w:numPr>
+          <w:ilvl w:val="0"/>
+          <w:numId w:val="2"/>
+        </w:numPr>
+        <w:spacing w:after="40" w:before="40"/>
+      </w:pPr>
+      <w:r>
+        <w:rPr>
+          <w:color w:val="1E293B"/>
+          <w:sz w:val="20"/>
+          <w:szCs w:val="20"/>
+        </w:rPr>
+        <w:t xml:space="preserve">14 Oct 2026 — PostgreSQL is live: scope (4.1, 4.3), FR-04 and assumption 14 corrected.</w:t>
+      </w:r>
+    </w:p>
+    <w:p>
+      <w:pPr>
+        <w:pStyle w:val="ListParagraph"/>
+        <w:numPr>
+          <w:ilvl w:val="0"/>
+          <w:numId w:val="2"/>
+        </w:numPr>
+        <w:spacing w:after="40" w:before="40"/>
+      </w:pPr>
+      <w:r>
+        <w:rPr>
+          <w:color w:val="1E293B"/>
+          <w:sz w:val="20"/>
+          <w:szCs w:val="20"/>
+        </w:rPr>
+        <w:t xml:space="preserve">14 Oct 2026 — FR-AC-01 adds the Access section (Invitations &amp; Access had none); FR-AC-05 names the real health checks; FR-AC-15 describes the privacy tools that exist.</w:t>
+      </w:r>
+    </w:p>
     <w:sectPr>
       <w:headerReference w:type="default" r:id="rId7"/>
       <w:footerReference w:type="default" r:id="rId8"/>

</xml_diff>

<commit_message>
Docs: record DEC-01 (BRD tier names) and DEC-03 (missing health-score data)
- DEC-01: health tiers Critical (0-39) / At Risk (40-59) / Healthy (60-100) per BRD FR-03;
  story CS2-04b in Sprint 1. Churn probability keeps High / Medium / Low risk.
- DEC-03: score from available components with re-normalised weights, data coverage shown,
  "Limited data" under 50% coverage, uploads never rejected (BRD FR-01a).
Updated: Sprint Plan, RAID, BRD, Project Plan, Test Cases.

Co-Authored-By: Claude Opus 5.5 <noreply@anthropic.com>
Claude-Session: https://claude.ai/code/session_01AFyT24RkX37m2MoRPATyVx
</commit_message>
<xml_diff>
--- a/Documents/BRD_ChurnSight_v2_0.docx
+++ b/Documents/BRD_ChurnSight_v2_0.docx
@@ -2295,6 +2295,24 @@
           <w:sz w:val="20"/>
           <w:szCs w:val="20"/>
         </w:rPr>
+        <w:t xml:space="preserve">FR-01a: When a dataset lacks the inputs for a component, the score uses the components that are available with their weights re-normalised. The card shows the data coverage (share of the total weight available) and scores under 50% coverage are marked "Limited data". Uploads are never rejected for missing component columns.</w:t>
+      </w:r>
+    </w:p>
+    <w:p>
+      <w:pPr>
+        <w:pStyle w:val="ListParagraph"/>
+        <w:numPr>
+          <w:ilvl w:val="0"/>
+          <w:numId w:val="2"/>
+        </w:numPr>
+        <w:spacing w:after="40" w:before="40"/>
+      </w:pPr>
+      <w:r>
+        <w:rPr>
+          <w:color w:val="1E293B"/>
+          <w:sz w:val="20"/>
+          <w:szCs w:val="20"/>
+        </w:rPr>
         <w:t xml:space="preserve">FR-02: System shall refresh scores on demand when a new dataset is uploaded.</w:t>
       </w:r>
     </w:p>
@@ -4447,6 +4465,24 @@
           <w:szCs w:val="20"/>
         </w:rPr>
         <w:t xml:space="preserve">14 Oct 2026 — FR-AC-01 adds the Access section (Invitations &amp; Access had none); FR-AC-05 names the real health checks; FR-AC-15 describes the privacy tools that exist.</w:t>
+      </w:r>
+    </w:p>
+    <w:p>
+      <w:pPr>
+        <w:pStyle w:val="ListParagraph"/>
+        <w:numPr>
+          <w:ilvl w:val="0"/>
+          <w:numId w:val="2"/>
+        </w:numPr>
+        <w:spacing w:after="40" w:before="40"/>
+      </w:pPr>
+      <w:r>
+        <w:rPr>
+          <w:color w:val="1E293B"/>
+          <w:sz w:val="20"/>
+          <w:szCs w:val="20"/>
+        </w:rPr>
+        <w:t xml:space="preserve">15 Oct 2026 — FR-01a added (missing component data, decision DEC-03). FR-03 tier names confirmed (decision DEC-01).</w:t>
       </w:r>
     </w:p>
     <w:sectPr>

</xml_diff>